<commit_message>
Add requirements.txt and uvicorn
</commit_message>
<xml_diff>
--- a/инструкция.docx
+++ b/инструкция.docx
@@ -81,6 +81,159 @@
       <w:proofErr w:type="spellEnd"/>
       <w:r>
         <w:t xml:space="preserve"> --reload --port 8000</w:t>
+      </w:r>
+    </w:p>
+    <w:p>
+      <w:pPr>
+        <w:rPr>
+          <w:lang w:val="ru-RU"/>
+        </w:rPr>
+      </w:pPr>
+      <w:hyperlink r:id="rId4" w:history="1">
+        <w:r>
+          <w:rPr>
+            <w:rStyle w:val="Hyperlink"/>
+          </w:rPr>
+          <w:t>http</w:t>
+        </w:r>
+        <w:r>
+          <w:rPr>
+            <w:rStyle w:val="Hyperlink"/>
+            <w:lang w:val="ru-RU"/>
+          </w:rPr>
+          <w:t>://127.0.0.1:8000](</w:t>
+        </w:r>
+        <w:r>
+          <w:rPr>
+            <w:rStyle w:val="Hyperlink"/>
+          </w:rPr>
+          <w:t>http</w:t>
+        </w:r>
+        <w:r>
+          <w:rPr>
+            <w:rStyle w:val="Hyperlink"/>
+            <w:lang w:val="ru-RU"/>
+          </w:rPr>
+          <w:t>://127.0.0.1:8000</w:t>
+        </w:r>
+      </w:hyperlink>
+    </w:p>
+    <w:p>
+      <w:pPr>
+        <w:rPr>
+          <w:lang w:val="ru-RU"/>
+        </w:rPr>
+      </w:pPr>
+      <w:hyperlink r:id="rId5" w:history="1">
+        <w:r>
+          <w:rPr>
+            <w:rStyle w:val="Hyperlink"/>
+          </w:rPr>
+          <w:t>http</w:t>
+        </w:r>
+        <w:r>
+          <w:rPr>
+            <w:rStyle w:val="Hyperlink"/>
+            <w:lang w:val="ru-RU"/>
+          </w:rPr>
+          <w:t>://127.0.0.1:8000/</w:t>
+        </w:r>
+      </w:hyperlink>
+    </w:p>
+    <w:p>
+      <w:pPr>
+        <w:rPr>
+          <w:rFonts w:ascii="Arial" w:hAnsi="Arial" w:cs="Arial"/>
+          <w:color w:val="1F1F1F"/>
+          <w:sz w:val="26"/>
+          <w:szCs w:val="26"/>
+          <w:shd w:val="clear" w:color="auto" w:fill="F2F0F0"/>
+          <w:lang w:val="ru-RU"/>
+        </w:rPr>
+      </w:pPr>
+      <w:r>
+        <w:rPr>
+          <w:rFonts w:ascii="Arial" w:hAnsi="Arial" w:cs="Arial"/>
+          <w:color w:val="1F1F1F"/>
+          <w:sz w:val="26"/>
+          <w:szCs w:val="26"/>
+          <w:shd w:val="clear" w:color="auto" w:fill="F2F0F0"/>
+          <w:lang w:val="ru-RU"/>
+        </w:rPr>
+        <w:t xml:space="preserve">Выбираем код на </w:t>
+      </w:r>
+      <w:r>
+        <w:rPr>
+          <w:rFonts w:ascii="Arial" w:hAnsi="Arial" w:cs="Arial"/>
+          <w:color w:val="1F1F1F"/>
+          <w:sz w:val="26"/>
+          <w:szCs w:val="26"/>
+          <w:shd w:val="clear" w:color="auto" w:fill="F2F0F0"/>
+        </w:rPr>
+        <w:t>GitHub</w:t>
+      </w:r>
+      <w:r>
+        <w:rPr>
+          <w:rFonts w:ascii="Arial" w:hAnsi="Arial" w:cs="Arial"/>
+          <w:color w:val="1F1F1F"/>
+          <w:sz w:val="26"/>
+          <w:szCs w:val="26"/>
+          <w:shd w:val="clear" w:color="auto" w:fill="F2F0F0"/>
+          <w:lang w:val="ru-RU"/>
+        </w:rPr>
+        <w:t xml:space="preserve"> и подключение к </w:t>
+      </w:r>
+      <w:r>
+        <w:rPr>
+          <w:rFonts w:ascii="Arial" w:hAnsi="Arial" w:cs="Arial"/>
+          <w:color w:val="1F1F1F"/>
+          <w:sz w:val="26"/>
+          <w:szCs w:val="26"/>
+          <w:shd w:val="clear" w:color="auto" w:fill="F2F0F0"/>
+        </w:rPr>
+        <w:t>Render</w:t>
+      </w:r>
+      <w:r>
+        <w:rPr>
+          <w:rFonts w:ascii="Arial" w:hAnsi="Arial" w:cs="Arial"/>
+          <w:color w:val="1F1F1F"/>
+          <w:sz w:val="26"/>
+          <w:szCs w:val="26"/>
+          <w:shd w:val="clear" w:color="auto" w:fill="F2F0F0"/>
+          <w:lang w:val="ru-RU"/>
+        </w:rPr>
+        <w:t>.</w:t>
+      </w:r>
+    </w:p>
+    <w:p>
+      <w:r>
+        <w:t>PS D:\Papa\PROG_OKX&gt; git config user.name "</w:t>
+      </w:r>
+      <w:proofErr w:type="spellStart"/>
+      <w:r>
+        <w:t>blisada</w:t>
+      </w:r>
+      <w:proofErr w:type="spellEnd"/>
+      <w:r>
+        <w:t>"</w:t>
+      </w:r>
+    </w:p>
+    <w:p>
+      <w:r>
+        <w:t xml:space="preserve">PS D:\Papa\PROG_OKX&gt; git config </w:t>
+      </w:r>
+      <w:proofErr w:type="spellStart"/>
+      <w:r>
+        <w:t>user.email</w:t>
+      </w:r>
+      <w:proofErr w:type="spellEnd"/>
+      <w:r>
+        <w:t xml:space="preserve"> "blisada@gmai.com"</w:t>
+      </w:r>
+    </w:p>
+    <w:p>
+      <w:r>
+        <w:t>PS D:\Papa\PROG_OKX&gt; git commit -m "Initial commit - RPS game"</w:t>
       </w:r>
     </w:p>
     <w:sectPr>
@@ -524,6 +677,29 @@
     <w:basedOn w:val="DefaultParagraphFont"/>
     <w:rsid w:val="0077074E"/>
   </w:style>
+  <w:style w:type="character" w:styleId="Hyperlink">
+    <w:name w:val="Hyperlink"/>
+    <w:basedOn w:val="DefaultParagraphFont"/>
+    <w:uiPriority w:val="99"/>
+    <w:unhideWhenUsed/>
+    <w:rsid w:val="005C289E"/>
+    <w:rPr>
+      <w:color w:val="0563C1" w:themeColor="hyperlink"/>
+      <w:u w:val="single"/>
+    </w:rPr>
+  </w:style>
+  <w:style w:type="character" w:styleId="UnresolvedMention">
+    <w:name w:val="Unresolved Mention"/>
+    <w:basedOn w:val="DefaultParagraphFont"/>
+    <w:uiPriority w:val="99"/>
+    <w:semiHidden/>
+    <w:unhideWhenUsed/>
+    <w:rsid w:val="005C289E"/>
+    <w:rPr>
+      <w:color w:val="605E5C"/>
+      <w:shd w:val="clear" w:color="auto" w:fill="E1DFDD"/>
+    </w:rPr>
+  </w:style>
 </w:styles>
 </file>
 

</xml_diff>